<commit_message>
Mise a jour de l'intro
</commit_message>
<xml_diff>
--- a/RAPPORT PROJET ING.docx
+++ b/RAPPORT PROJET ING.docx
@@ -872,6 +872,7 @@
         <w:t>INTRODUCTION</w:t>
       </w:r>
     </w:p>
+    <w:p/>
     <w:p>
       <w:pPr>
         <w:jc w:val="both"/>
@@ -901,17 +902,15 @@
           <w:rFonts w:asciiTheme="majorHAnsi" w:eastAsia="Times New Roman" w:hAnsiTheme="majorHAnsi" w:cstheme="majorHAnsi"/>
           <w:lang w:val="fr-FR"/>
         </w:rPr>
-        <w:t>) offrent désormais une opportunité unique pour étudier ces phénomènes thermiques avec une précision inédite. Ces données massives, associées aux techniques avancées d'intelligence artificielle et d'apprentissage automatique, constituent un nouveau paradigme pour la compréhension des variations climatiques locales et permettent d'élaborer des modèles d'apprentissage supervisé adaptés à la prédiction thermique.</w:t>
-      </w:r>
-    </w:p>
-    <w:p>
-      <w:pPr>
-        <w:jc w:val="both"/>
+        <w:t>) offrent désormais une opportunité unique pour étudier ces phénomènes thermiques avec une précision inédite</w:t>
+      </w:r>
+      <w:r>
         <w:rPr>
           <w:rFonts w:asciiTheme="majorHAnsi" w:eastAsia="Times New Roman" w:hAnsiTheme="majorHAnsi" w:cstheme="majorHAnsi"/>
           <w:lang w:val="fr-FR"/>
         </w:rPr>
-      </w:pPr>
+        <w:t xml:space="preserve">. </w:t>
+      </w:r>
       <w:r>
         <w:rPr>
           <w:rFonts w:asciiTheme="majorHAnsi" w:eastAsia="Times New Roman" w:hAnsiTheme="majorHAnsi" w:cstheme="majorHAnsi"/>
@@ -919,21 +918,19 @@
         </w:rPr>
         <w:t>Face à ces enjeux climatiques, la capacité à prévoir et à comprendre les variations thermiques à l'échelle locale devient un outil stratégique pour les décideurs et les acteurs de l'aménagement territorial. Cependant, l'exploitation efficace de ces masses de données requiert l'application de méthodologies sophistiquées et l'intégration de multiples sources d'information hétérogènes. La question centrale demeure : comment transformer des données brutes en modèles prédictifs fiables et exploitables capables non seulement d'anticiper les variations thermiques, mais aussi de segmenter les territoires présentant des caractéristiques similaires ?</w:t>
       </w:r>
-    </w:p>
-    <w:p>
-      <w:pPr>
-        <w:jc w:val="both"/>
+      <w:r>
         <w:rPr>
           <w:rFonts w:asciiTheme="majorHAnsi" w:eastAsia="Times New Roman" w:hAnsiTheme="majorHAnsi" w:cstheme="majorHAnsi"/>
           <w:lang w:val="fr-FR"/>
         </w:rPr>
-      </w:pPr>
+        <w:t xml:space="preserve"> </w:t>
+      </w:r>
       <w:r>
         <w:rPr>
           <w:rFonts w:asciiTheme="majorHAnsi" w:eastAsia="Times New Roman" w:hAnsiTheme="majorHAnsi" w:cstheme="majorHAnsi"/>
           <w:lang w:val="fr-FR"/>
         </w:rPr>
-        <w:t>C'est dans ce contexte que s'inscrit le Projet 10 : la conception d'un modèle prédictif de la température de surface terrestre en exploitant les données satellitaires en libre accès. Au-delà de la simple prédiction numérique, ce projet aspire à générer des insights exploitables et des recommandations concrètes pour lutter contre le réchauffement localisé, tout en favorisant une coopération scientifique basée sur l'identification de territoires aux caractéristiques thermiques similaires. Le présent rapport détaille la méthodologie mise en œuvre, les résultats obtenus et les analyses interprétatives découlant de cette démarche, dans l'objectif de transformer des données brutes en connaissance stratégique du climat et d'en dégager des pistes d'interprétation et recommandations exploitables.</w:t>
+        <w:t xml:space="preserve">C'est dans ce contexte que s'inscrit le Projet 10 : la conception d'un modèle prédictif de la température de surface terrestre en exploitant les données satellitaires en libre accès. Au-delà de la simple prédiction numérique, ce projet aspire à générer des insights exploitables et des recommandations concrètes pour lutter contre le réchauffement localisé, tout en favorisant une coopération scientifique basée sur l'identification de territoires aux caractéristiques thermiques similaires. </w:t>
       </w:r>
     </w:p>
     <w:p>

</xml_diff>